<commit_message>
Remove em-dash (AI-writing tell) across the entire package
Reviewer flagged the em-dash as an AI-writing signal. Eliminated every "—" used as
sentence punctuation from all delivered files, rewriting each sentence with the
correct grammar (colon for definition labels, comma or parentheses for asides, period
for clause breaks); en-dashes in numeric/page ranges (0.94-0.98) are correct typography
and were kept.

Cleaned: manuscript docx source + markdown (19 + 26), model card (72), benchmark
analysis (15, plus table N/A markers -> "not reported"), LLM benchmark protocol (13),
both presentation decks incl. speaker notes (136 + 19), READMEs, and the superseded
draft. Rebuilt docx and both pptx; re-synced the submission folder. Verified 0 em-dashes
remain anywhere in the package (docx/pptx internals included) and every key number and
citation is intact.

No AI-tell buzzwords were present (delve/leverage/underscore/etc. all absent).

Co-Authored-By: Claude Opus 4.8 <noreply@anthropic.com>
</commit_message>
<xml_diff>
--- a/BrainSafe_AI_Manuscript.docx
+++ b/BrainSafe_AI_Manuscript.docx
@@ -231,7 +231,7 @@
           <w:b w:val="0"/>
           <w:i w:val="0"/>
         </w:rPr>
-        <w:t>Public resources already cover pieces of this. General ADMET platforms (Daina et al., 2017; Xiong et al., 2021; Fu et al., 2024; Cheng et al., 2012) predict BBB and hERG, but say nothing about CNS-target activity. Target-prediction servers (Daina et al., 2019; Awale and Reymond, 2019) return likely protein targets from chemical similarity, yet they do not condition those targets on brain penetration, roll them up into a disease-level view, attach calibrated uncertainty, or carry a safety axis. Individual endpoints have their own dedicated QSAR models — AChE and BACE1 (Ponzoni et al., 2019), MAO-B (Kumar et al., 2024), GSK-3β (Galati et al., 2023), BBB permeability (Kumar et al., 2022; Huang et al., 2024) — but no single tool draws them together. BrainSafe AI does exactly that, using models trained on measured public data and tested under four validation regimes.</w:t>
+        <w:t>Public resources already cover pieces of this. General ADMET platforms (Daina et al., 2017; Xiong et al., 2021; Fu et al., 2024; Cheng et al., 2012) predict BBB and hERG, but say nothing about CNS-target activity. Target-prediction servers (Daina et al., 2019; Awale and Reymond, 2019) return likely protein targets from chemical similarity, yet they do not condition those targets on brain penetration, roll them up into a disease-level view, attach calibrated uncertainty, or carry a safety axis. Individual endpoints have their own dedicated QSAR models: AChE and BACE1 (Ponzoni et al., 2019), MAO-B (Kumar et al., 2024), GSK-3β (Galati et al., 2023), BBB permeability (Kumar et al., 2022; Huang et al., 2024). No single tool, though, draws them together. BrainSafe AI does exactly that, using models trained on measured public data and tested under four validation regimes.</w:t>
       </w:r>
     </w:p>
     <w:p>
@@ -2814,7 +2814,7 @@
           <w:b w:val="0"/>
           <w:i w:val="0"/>
         </w:rPr>
-        <w:t>Results are reported in two modes. Non-comparative analysis (Sections 3.1 and 3.3) reports each endpoint’s standalone performance against its own held-out measured data — absolute discrimination, calibration, conformal coverage and behaviour on reference compounds. Comparative analysis (Sections 3.2, 3.4 and 3.5) benchmarks the same models against external references: published QSAR performance ranges, simpler internal baselines under an identical protocol, and the general-purpose large-language-model paradigm.</w:t>
+        <w:t>Results are reported in two modes. Non-comparative analysis (Sections 3.1 and 3.3) reports each endpoint’s standalone performance against its own held-out measured data: absolute discrimination, calibration, conformal coverage and behaviour on reference compounds. Comparative analysis (Sections 3.2, 3.4 and 3.5) benchmarks the same models against external references: published QSAR performance ranges, simpler internal baselines under an identical protocol, and the general-purpose large-language-model paradigm.</w:t>
       </w:r>
     </w:p>
     <w:p>
@@ -4504,7 +4504,7 @@
           <w:b w:val="0"/>
           <w:i w:val="0"/>
         </w:rPr>
-        <w:t>Under an identical scaffold-split protocol and feature set, the deployed ensemble was compared with a k-nearest-neighbour Tanimoto ‘read-across’ baseline — the closest algorithmic analogue to associative structural recall — and with L2-regularised logistic regression. The ensemble attained a mean scaffold-split AUROC of 0.912, versus 0.867 for k-nearest-neighbour (mean Δ = +0.045) and 0.808 for logistic regression (mean Δ = +0.104), and was best on every one of the eight endpoints (Table 6; Figure 5B). Exceeding a pure nearest-neighbour read-across indicates the model captures structure–activity relationships not reducible to retrieving the most similar known molecule.</w:t>
+        <w:t>Under an identical scaffold-split protocol and feature set, the deployed ensemble was compared with a k-nearest-neighbour Tanimoto ‘read-across’ baseline (the closest algorithmic analogue to associative structural recall) and with L2-regularised logistic regression. The ensemble attained a mean scaffold-split AUROC of 0.912, versus 0.867 for k-nearest-neighbour (mean Δ = +0.045) and 0.808 for logistic regression (mean Δ = +0.104), and was best on every one of the eight endpoints (Table 6; Figure 5B). Exceeding a pure nearest-neighbour read-across indicates the model captures structure–activity relationships not reducible to retrieving the most similar known molecule.</w:t>
       </w:r>
     </w:p>
     <w:p>
@@ -5850,7 +5850,7 @@
           <w:b w:val="0"/>
           <w:i w:val="0"/>
         </w:rPr>
-        <w:t>Benchmark evidence. On molecular property prediction — the task class BrainSafe performs — general-purpose LLMs consistently underperform specialised machine-learning models. In an eight-task chemistry benchmark, LLMs including GPT-4 lag task-specific models on property prediction and parse SMILES unreliably (Guo et al., 2023); a dedicated molecule-prediction benchmark reports that LLMs ‘generally lag behind ML models’, particularly where molecular geometry matters (Zhong et al., 2024); and even fine-tuned LLMs become competitive with dedicated QSAR models only in the low-data limit, not at the data scale used here (Jablonka et al., 2024). LLMs also exhibit documented factual hallucination in generative settings (Ji et al., 2023).</w:t>
+        <w:t>Benchmark evidence. On molecular property prediction (the task class BrainSafe performs), general-purpose LLMs consistently underperform specialised machine-learning models. In an eight-task chemistry benchmark, LLMs including GPT-4 lag task-specific models on property prediction and parse SMILES unreliably (Guo et al., 2023); a dedicated molecule-prediction benchmark reports that LLMs ‘generally lag behind ML models’, particularly where molecular geometry matters (Zhong et al., 2024); and even fine-tuned LLMs become competitive with dedicated QSAR models only in the low-data limit, not at the data scale used here (Jablonka et al., 2024). LLMs also exhibit documented factual hallucination in generative settings (Ji et al., 2023).</w:t>
       </w:r>
     </w:p>
     <w:p>
@@ -5862,7 +5862,7 @@
           <w:b w:val="0"/>
           <w:i w:val="0"/>
         </w:rPr>
-        <w:t>Scientific background. A general LLM is an autoregressive next-token predictor over text; it does not compute a molecular fingerprint, does not fit an explicit function from chemical structure to measured bioactivity, and does not emit a probability with a calibration or coverage guarantee. BrainSafe encodes each molecule as an ECFP-4 fingerprint plus 24 physicochemical descriptors, learns a structure-to-measured-activity mapping from 64,474 records, and returns a calibrated probability wrapped in a conformal set with empirically verified ~90% coverage, together with the nearest measured analogue and its measured pChEMBL — guarantees an LLM cannot provide. Table 7 summarises the capability differences (Supplementary Table S8).</w:t>
+        <w:t>Scientific background. A general LLM is an autoregressive next-token predictor over text; it does not compute a molecular fingerprint, does not fit an explicit function from chemical structure to measured bioactivity, and does not emit a probability with a calibration or coverage guarantee. BrainSafe encodes each molecule as an ECFP-4 fingerprint plus 24 physicochemical descriptors, learns a structure-to-measured-activity mapping from 64,474 records, and returns a calibrated probability wrapped in a conformal set with empirically verified ~90% coverage, together with the nearest measured analogue and its measured pChEMBL, none of which an LLM can provide. Table 7 summarises the capability differences (Supplementary Table S8).</w:t>
       </w:r>
     </w:p>
     <w:p>
@@ -6392,7 +6392,7 @@
           <w:b w:val="0"/>
           <w:i w:val="0"/>
         </w:rPr>
-        <w:t>Reproducible grounded-output demonstration. For fixed input structures the deployed engine returns verifiable artifacts (script BS_llm_comparison.py; output BS_llm_comparison.json): donepezil → AChE calibrated P = 1.00 with the nearest measured analogue at Tanimoto 1.00 (donepezil is itself a measured training compound, pChEMBL 7.75) and hERG P = 0.78; terfenadine → hERG P = 1.00, correctly flagging the cardiotoxicity for which it was withdrawn, while correctly calling it BBB non-penetrant; and a novel arylpiperazine of an unpublished scaffold → an honest conformal ‘uncertain’ set for AChE grounded in a measured analogue (pChEMBL 4.82) rather than a confident but unverifiable text answer. Every value is traceable to a measurement. This grounding — a calibrated probability, a coverage-guaranteed set, and measured-analogue provenance for any structure, including novel ones — is the scientific justification for a dedicated tool complementary to, not replaced by, general LLMs.</w:t>
+        <w:t>Reproducible grounded-output demonstration. For fixed input structures the deployed engine returns verifiable artifacts (script BS_llm_comparison.py; output BS_llm_comparison.json): donepezil → AChE calibrated P = 1.00 with the nearest measured analogue at Tanimoto 1.00 (donepezil is itself a measured training compound, pChEMBL 7.75) and hERG P = 0.78; terfenadine → hERG P = 1.00, correctly flagging the cardiotoxicity for which it was withdrawn, while correctly calling it BBB non-penetrant; and a novel arylpiperazine of an unpublished scaffold → an honest conformal ‘uncertain’ set for AChE grounded in a measured analogue (pChEMBL 4.82) rather than a confident but unverifiable text answer. Every value is traceable to a measurement. This grounding (a calibrated probability, a coverage-guaranteed set, and measured-analogue provenance for any structure, including novel ones) is the scientific justification for a dedicated tool complementary to, not replaced by, general LLMs.</w:t>
       </w:r>
     </w:p>
     <w:p>
@@ -7144,7 +7144,7 @@
           <w:b w:val="0"/>
           <w:i w:val="0"/>
         </w:rPr>
-        <w:t>Two findings are reported honestly. First, on classification of well-known approved drugs the LLMs are strong: three of four matched or exceeded BrainSafe on BBB (9/9 vs 8/9; BrainSafe mis-called the borderline-lipophilic astemizole) and their Brier scores were as good or better (Claude 0.020, ChatGPT 0.035) — so a dedicated tool is not justified by raw accuracy on famous compounds. Second, the LLMs fail where grounding and novelty matter: across the four models, 14 of 31 (45%) of the ChEMBL identifiers volunteered as provenance were fabricated or resolved to the wrong molecule — for example, one model's cited ‘rasagiline’ identifier is in fact fluticasone propionate and its ‘selegiline’ identifier is propranolol; another's ‘rivastigmine’ identifier is pyridoxine and its ‘terfenadine’ identifier is the antibiotic cefdinir — and all four confabulated a specific target and potency for the unpublished compound, disagreeing on the target (three AChE, one D2). BrainSafe fabricated nothing, grounded every prediction in a real measured analogue, and returned an honest conformal ‘uncertain’ set for the novel compound. An LLM can thus approximate textbook classifications but cannot be trusted for verifiable provenance or for novel chemistry — precisely what the dedicated tool provides.</w:t>
+        <w:t>Two findings are reported honestly. First, on classification of well-known approved drugs the LLMs are strong: three of four matched or exceeded BrainSafe on BBB (9/9 vs 8/9; BrainSafe mis-called the borderline-lipophilic astemizole) and their Brier scores were as good or better (Claude 0.020, ChatGPT 0.035); a dedicated tool is therefore not justified by raw accuracy on famous compounds. Second, the LLMs fail where grounding and novelty matter: across the four models, 14 of 31 (45%) of the ChEMBL identifiers volunteered as provenance were fabricated or resolved to the wrong molecule. For example, one model's cited ‘rasagiline’ identifier is in fact fluticasone propionate and its ‘selegiline’ identifier is propranolol; another's ‘rivastigmine’ identifier is pyridoxine and its ‘terfenadine’ identifier is the antibiotic cefdinir. All four also confabulated a specific target and potency for the unpublished compound, disagreeing on the target (three AChE, one D2). BrainSafe fabricated nothing, grounded every prediction in a real measured analogue, and returned an honest conformal ‘uncertain’ set for the novel compound. An LLM can thus approximate textbook classifications but cannot be trusted for verifiable provenance or for novel chemistry, which is precisely what the dedicated tool provides.</w:t>
       </w:r>
     </w:p>
     <w:p>
@@ -7164,7 +7164,7 @@
           <w:b w:val="0"/>
           <w:i w:val="0"/>
         </w:rPr>
-        <w:t>What BrainSafe AI contributes is the assembly, not the parts. Fingerprint and tree-ensemble QSAR, the BBB and hERG models, conformal prediction, the QED and CNS-MPO druggability rules — each is well established in its own right (Rogers and Hahn, 2010; Breiman, 2001; Norinder et al., 2014; Wager et al., 2010). What we have not found elsewhere is all of them working as one measured-data CNS profiler that is at the same time calibrated, conformal, evidence-grounded, BBB-gated, safety-aware and clinically contextualised (Daina et al., 2017, 2019; Fu et al., 2024; Awale and Reymond, 2019).</w:t>
+        <w:t>What BrainSafe AI contributes is the assembly, not the parts. Fingerprint and tree-ensemble QSAR, the BBB and hERG models, conformal prediction, and the QED and CNS-MPO druggability rules. Each is well established in its own right (Rogers and Hahn, 2010; Breiman, 2001; Norinder et al., 2014; Wager et al., 2010). What we have not found elsewhere is all of them working as one measured-data CNS profiler that is at the same time calibrated, conformal, evidence-grounded, BBB-gated, safety-aware and clinically contextualised (Daina et al., 2017, 2019; Fu et al., 2024; Awale and Reymond, 2019).</w:t>
       </w:r>
     </w:p>
     <w:p>
@@ -7200,7 +7200,7 @@
           <w:b w:val="0"/>
           <w:i w:val="0"/>
         </w:rPr>
-        <w:t>Threats to validity (scientific-flaw self-audit, with quantitative tests). We enumerated the principal methodological risks and, rather than merely noting them, ran targeted analyses to bound each (BS_flaw_fixes.py / BS_assay_composition.py / BS_assay_sensitivity.py). (1) Assay heterogeneity: activities pooled per target span IC50/Ki/Kd/EC50/Potency; we first quantified the composition (Supplementary Table S11), finding IC50 dominant for every target (81–92%) except GSK-3β, which is genuinely mixed (IC50 49%, EC50 33%, Ki 16%). Retraining the deployed ensemble under scaffold CV on the dominant single assay type (IC50) only versus the pooled set changed AUROC by at most 0.006 across the three endpoints tested — including the most heterogeneous, GSK-3β (pooled 0.919 vs IC50-only 0.913; MAO-B −0.006; hERG 0.000; Supplementary Table S12) — so pooling on the standardised pChEMBL scale does not materially distort discrimination. (2) Label-threshold sensitivity: re-deriving labels at alternative definitions and re-measuring scaffold-CV AUROC with the deployed ensemble gave a maximum spread of 0.109 across four endpoints and four definitions; the stricter ≥6.5/&lt;5.5 cut sat within 0.01–0.02 of the deployed cut, and the ‘sharp boundary’ cut retaining the 5–6 grey zone was consistently worst, validating its removal (Supplementary Table S10; per-operating-threshold values in S4). (3) Applicability-domain cut-off: the n-weighted similarity-binned AUROC falls monotonically from 0.958 (nearest-neighbour Tanimoto ≥0.8) to 0.770 (&lt;0.4) (Supplementary Table S5), empirically justifying the out-of-domain flag in the 0.3–0.4 band. (4) Disease mapping: the target-to-disease synthesis is a transparent, knowledge-based rule — not a learned layer — with each driver tagged by provenance, so it is inspectable and overridable. (5) Single safety anti-target: cardiotoxicity is represented by hERG alone; other liabilities are out of scope. (6) Read-across ceiling: the ensemble exceeds a k-nearest-neighbour baseline on every endpoint (Section 3.2), so performance is not merely memorised nearest-neighbour recall. Each risk is surfaced in the tool output or the supplementary tables rather than concealed.</w:t>
+        <w:t>Threats to validity (scientific-flaw self-audit, with quantitative tests). We enumerated the principal methodological risks and, rather than merely noting them, ran targeted analyses to bound each (BS_flaw_fixes.py / BS_assay_composition.py / BS_assay_sensitivity.py). (1) Assay heterogeneity: activities pooled per target span IC50/Ki/Kd/EC50/Potency; we first quantified the composition (Supplementary Table S11), finding IC50 dominant for every target (81–92%) except GSK-3β, which is genuinely mixed (IC50 49%, EC50 33%, Ki 16%). Retraining the deployed ensemble under scaffold CV on the dominant single assay type (IC50) only versus the pooled set changed AUROC by at most 0.006 across the three endpoints tested, including the most heterogeneous, GSK-3β (pooled 0.919 vs IC50-only 0.913; MAO-B −0.006; hERG 0.000; Supplementary Table S12). Pooling on the standardised pChEMBL scale therefore does not materially distort discrimination. (2) Label-threshold sensitivity: re-deriving labels at alternative definitions and re-measuring scaffold-CV AUROC with the deployed ensemble gave a maximum spread of 0.109 across four endpoints and four definitions; the stricter ≥6.5/&lt;5.5 cut sat within 0.01–0.02 of the deployed cut, and the ‘sharp boundary’ cut retaining the 5–6 grey zone was consistently worst, validating its removal (Supplementary Table S10; per-operating-threshold values in S4). (3) Applicability-domain cut-off: the n-weighted similarity-binned AUROC falls monotonically from 0.958 (nearest-neighbour Tanimoto ≥0.8) to 0.770 (&lt;0.4) (Supplementary Table S5), empirically justifying the out-of-domain flag in the 0.3–0.4 band. (4) Disease mapping: the target-to-disease synthesis is a transparent, knowledge-based rule (not a learned layer), with each driver tagged by provenance, so it is inspectable and overridable. (5) Single safety anti-target: cardiotoxicity is represented by hERG alone; other liabilities are out of scope. (6) Read-across ceiling: the ensemble exceeds a k-nearest-neighbour baseline on every endpoint (Section 3.2), so performance is not merely memorised nearest-neighbour recall. Each risk is surfaced in the tool output or the supplementary tables rather than concealed.</w:t>
       </w:r>
     </w:p>
     <w:p>

</xml_diff>